<commit_message>
Formelsammlungen als gestaltete PDFs mit Beispielen; Lernhilfen in Probeklausur 3
Co-Authored-By: Claude Opus 5.5 <noreply@anthropic.com>
Claude-Session: https://claude.ai/code/session_01P4KgSUCR1Ujnou9Dyw4sRM
</commit_message>
<xml_diff>
--- a/lernpaket/Formelsammlung_R_TeilB.docx
+++ b/lernpaket/Formelsammlung_R_TeilB.docx
@@ -92,6 +92,43 @@
           <w:szCs w:val="22"/>
         </w:rPr>
         <w:t xml:space="preserve"> dunkler Hintergrund = R-Code; Zeilen mit # sind Kommentare, Zeilen mit [1] zeigen den Output.</w:t>
+      </w:r>
+    </w:p>
+    <w:p>
+      <w:pPr>
+        <w:spacing w:after="80"/>
+      </w:pPr>
+      <w:r>
+        <w:rPr>
+          <w:b/>
+          <w:bCs/>
+          <w:sz w:val="22"/>
+          <w:szCs w:val="22"/>
+        </w:rPr>
+        <w:t xml:space="preserve">Beispieldaten:</w:t>
+      </w:r>
+      <w:r>
+        <w:rPr>
+          <w:sz w:val="22"/>
+          <w:szCs w:val="22"/>
+        </w:rPr>
+        <w:t xml:space="preserve"> Alle R-Outputs stammen aus </w:t>
+      </w:r>
+      <w:r>
+        <w:rPr>
+          <w:rFonts w:ascii="Consolas" w:cs="Consolas" w:eastAsia="Consolas" w:hAnsi="Consolas"/>
+          <w:color w:val="0B3D2E"/>
+          <w:sz w:val="22"/>
+          <w:szCs w:val="22"/>
+        </w:rPr>
+        <w:t xml:space="preserve">Beispiel_Mensa.csv</w:t>
+      </w:r>
+      <w:r>
+        <w:rPr>
+          <w:sz w:val="22"/>
+          <w:szCs w:val="22"/>
+        </w:rPr>
+        <w:t xml:space="preserve"> (Ordner uebungsdaten) – zum Nachrechnen.</w:t>
       </w:r>
     </w:p>
     <w:p>
@@ -2493,43 +2530,43 @@
           <w:sz w:val="18"/>
           <w:szCs w:val="18"/>
         </w:rPr>
-        <w:t xml:space="preserve">class(d$Studio)        # [1] "character"</w:t>
-      </w:r>
-    </w:p>
-    <w:p>
-      <w:pPr>
-        <w:keepNext/>
-        <w:keepLines/>
-        <w:shd w:fill="1E293B" w:color="auto" w:val="clear"/>
-        <w:spacing w:after="0" w:before="0" w:line="260"/>
-        <w:ind w:left="120" w:right="120"/>
-      </w:pPr>
-      <w:r>
-        <w:rPr>
-          <w:rFonts w:ascii="Consolas" w:cs="Consolas" w:eastAsia="Consolas" w:hAnsi="Consolas"/>
-          <w:color w:val="F1F5F9"/>
-          <w:sz w:val="18"/>
-          <w:szCs w:val="18"/>
-        </w:rPr>
-        <w:t xml:space="preserve">class(d$Besuche)       # [1] "integer"</w:t>
-      </w:r>
-    </w:p>
-    <w:p>
-      <w:pPr>
-        <w:keepNext/>
-        <w:keepLines/>
-        <w:shd w:fill="1E293B" w:color="auto" w:val="clear"/>
-        <w:spacing w:after="0" w:before="0" w:line="260"/>
-        <w:ind w:left="120" w:right="120"/>
-      </w:pPr>
-      <w:r>
-        <w:rPr>
-          <w:rFonts w:ascii="Consolas" w:cs="Consolas" w:eastAsia="Consolas" w:hAnsi="Consolas"/>
-          <w:color w:val="F1F5F9"/>
-          <w:sz w:val="18"/>
-          <w:szCs w:val="18"/>
-        </w:rPr>
-        <w:t xml:space="preserve">typeof(d$Minuten)      # [1] "integer" bzw. "double"</w:t>
+        <w:t xml:space="preserve">class(d$Mensa)         # [1] "character"</w:t>
+      </w:r>
+    </w:p>
+    <w:p>
+      <w:pPr>
+        <w:keepNext/>
+        <w:keepLines/>
+        <w:shd w:fill="1E293B" w:color="auto" w:val="clear"/>
+        <w:spacing w:after="0" w:before="0" w:line="260"/>
+        <w:ind w:left="120" w:right="120"/>
+      </w:pPr>
+      <w:r>
+        <w:rPr>
+          <w:rFonts w:ascii="Consolas" w:cs="Consolas" w:eastAsia="Consolas" w:hAnsi="Consolas"/>
+          <w:color w:val="F1F5F9"/>
+          <w:sz w:val="18"/>
+          <w:szCs w:val="18"/>
+        </w:rPr>
+        <w:t xml:space="preserve">class(d$Gerichte)      # [1] "integer"</w:t>
+      </w:r>
+    </w:p>
+    <w:p>
+      <w:pPr>
+        <w:keepNext/>
+        <w:keepLines/>
+        <w:shd w:fill="1E293B" w:color="auto" w:val="clear"/>
+        <w:spacing w:after="0" w:before="0" w:line="260"/>
+        <w:ind w:left="120" w:right="120"/>
+      </w:pPr>
+      <w:r>
+        <w:rPr>
+          <w:rFonts w:ascii="Consolas" w:cs="Consolas" w:eastAsia="Consolas" w:hAnsi="Consolas"/>
+          <w:color w:val="F1F5F9"/>
+          <w:sz w:val="18"/>
+          <w:szCs w:val="18"/>
+        </w:rPr>
+        <w:t xml:space="preserve">typeof(d$Wartezeit)    # [1] "double"</w:t>
       </w:r>
     </w:p>
     <w:p>
@@ -2565,7 +2602,7 @@
           <w:sz w:val="18"/>
           <w:szCs w:val="18"/>
         </w:rPr>
-        <w:t xml:space="preserve">d$Studio &lt;- as.factor(d$Studio)       # in Faktor umwandeln</w:t>
+        <w:t xml:space="preserve">d$Mensa &lt;- as.factor(d$Mensa)       # in Faktor umwandeln</w:t>
       </w:r>
     </w:p>
     <w:p>
@@ -2601,7 +2638,7 @@
           <w:sz w:val="18"/>
           <w:szCs w:val="18"/>
         </w:rPr>
-        <w:t xml:space="preserve">levels(d$Studio)                      # Kategorien eines Faktors</w:t>
+        <w:t xml:space="preserve">levels(d$Mensa)                      # Kategorien eines Faktors</w:t>
       </w:r>
     </w:p>
     <w:p>
@@ -2624,7 +2661,7 @@
         <w:t xml:space="preserve">✎ ANTWORTSATZ: </w:t>
       </w:r>
       <w:r>
-        <w:t xml:space="preserve">„Die Variable Studio ist ein Objekt vom Typ character (Text), die Variable Besuche ist ein numerisches Objekt vom Typ integer, d. h. sie enthält nur ganze Zahlen.“</w:t>
+        <w:t xml:space="preserve">„Die Variable Mensa ist ein Objekt vom Typ character (Text), die Variable Gerichte ist ein numerisches Objekt vom Typ integer, d. h. sie enthält nur ganze Zahlen.“</w:t>
       </w:r>
     </w:p>
     <w:p>
@@ -2738,7 +2775,7 @@
           <w:sz w:val="18"/>
           <w:szCs w:val="18"/>
         </w:rPr>
-        <w:t xml:space="preserve">d &lt;- read.csv("Fitness.csv", sep = ",", dec = ".", header = TRUE)</w:t>
+        <w:t xml:space="preserve">d &lt;- read.csv("Beispiel_Mensa.csv", sep = ",", dec = ".", header = TRUE)</w:t>
       </w:r>
     </w:p>
     <w:p>
@@ -2911,7 +2948,7 @@
           <w:sz w:val="18"/>
           <w:szCs w:val="18"/>
         </w:rPr>
-        <w:t xml:space="preserve">d$Minuten                         # eine Spalte (Vektor)</w:t>
+        <w:t xml:space="preserve">d$Dauer                         # eine Spalte (Vektor)</w:t>
       </w:r>
     </w:p>
     <w:p>
@@ -2965,133 +3002,133 @@
           <w:sz w:val="18"/>
           <w:szCs w:val="18"/>
         </w:rPr>
-        <w:t xml:space="preserve">d[d$Studio == "Nord", ]           # nur Zeilen von Studio Nord</w:t>
-      </w:r>
-    </w:p>
-    <w:p>
-      <w:pPr>
-        <w:keepNext/>
-        <w:keepLines/>
-        <w:shd w:fill="1E293B" w:color="auto" w:val="clear"/>
-        <w:spacing w:after="0" w:before="0" w:line="260"/>
-        <w:ind w:left="120" w:right="120"/>
-      </w:pPr>
-      <w:r>
-        <w:rPr>
-          <w:rFonts w:ascii="Consolas" w:cs="Consolas" w:eastAsia="Consolas" w:hAnsi="Consolas"/>
-          <w:color w:val="F1F5F9"/>
-          <w:sz w:val="18"/>
-          <w:szCs w:val="18"/>
-        </w:rPr>
-        <w:t xml:space="preserve">subset(d, Abo == "Premium" &amp; Minuten &gt; 60)</w:t>
-      </w:r>
-    </w:p>
-    <w:p>
-      <w:pPr>
-        <w:keepNext/>
-        <w:keepLines/>
-        <w:shd w:fill="1E293B" w:color="auto" w:val="clear"/>
-        <w:spacing w:after="0" w:before="0" w:line="260"/>
-        <w:ind w:left="120" w:right="120"/>
-      </w:pPr>
-      <w:r>
-        <w:rPr>
-          <w:rFonts w:ascii="Consolas" w:cs="Consolas" w:eastAsia="Consolas" w:hAnsi="Consolas"/>
-          <w:color w:val="F1F5F9"/>
-          <w:sz w:val="18"/>
-          <w:szCs w:val="18"/>
-        </w:rPr>
-        <w:t xml:space="preserve">d$Stunden &lt;- d$Minuten / 60       # neue Spalte</w:t>
-      </w:r>
-    </w:p>
-    <w:p>
-      <w:pPr>
-        <w:keepNext/>
-        <w:keepLines/>
-        <w:shd w:fill="1E293B" w:color="auto" w:val="clear"/>
-        <w:spacing w:after="0" w:before="0" w:line="260"/>
-        <w:ind w:left="120" w:right="120"/>
-      </w:pPr>
-      <w:r>
-        <w:rPr>
-          <w:rFonts w:ascii="Consolas" w:cs="Consolas" w:eastAsia="Consolas" w:hAnsi="Consolas"/>
-          <w:color w:val="F1F5F9"/>
-          <w:sz w:val="18"/>
-          <w:szCs w:val="18"/>
-        </w:rPr>
-        <w:t xml:space="preserve">d$lang &lt;- ifelse(d$Minuten &gt; 70, "ja", "nein")</w:t>
-      </w:r>
-    </w:p>
-    <w:p>
-      <w:pPr>
-        <w:keepNext/>
-        <w:keepLines/>
-        <w:shd w:fill="1E293B" w:color="auto" w:val="clear"/>
-        <w:spacing w:after="0" w:before="0" w:line="260"/>
-        <w:ind w:left="120" w:right="120"/>
-      </w:pPr>
-      <w:r>
-        <w:rPr>
-          <w:rFonts w:ascii="Consolas" w:cs="Consolas" w:eastAsia="Consolas" w:hAnsi="Consolas"/>
-          <w:color w:val="F1F5F9"/>
-          <w:sz w:val="18"/>
-          <w:szCs w:val="18"/>
-        </w:rPr>
-        <w:t xml:space="preserve">mean(d$Minuten[d$Abo == "Premium"])   # Mittel einer Teilgruppe</w:t>
-      </w:r>
-    </w:p>
-    <w:p>
-      <w:pPr>
-        <w:keepNext/>
-        <w:keepLines/>
-        <w:shd w:fill="1E293B" w:color="auto" w:val="clear"/>
-        <w:spacing w:after="0" w:before="0" w:line="260"/>
-        <w:ind w:left="120" w:right="120"/>
-      </w:pPr>
-      <w:r>
-        <w:rPr>
-          <w:rFonts w:ascii="Consolas" w:cs="Consolas" w:eastAsia="Consolas" w:hAnsi="Consolas"/>
-          <w:color w:val="F1F5F9"/>
-          <w:sz w:val="18"/>
-          <w:szCs w:val="18"/>
-        </w:rPr>
-        <w:t xml:space="preserve">sum(d$Abo == "Premium")           # Anzahl Premium (TRUE zählt 1)</w:t>
-      </w:r>
-    </w:p>
-    <w:p>
-      <w:pPr>
-        <w:keepNext/>
-        <w:keepLines/>
-        <w:shd w:fill="1E293B" w:color="auto" w:val="clear"/>
-        <w:spacing w:after="0" w:before="0" w:line="260"/>
-        <w:ind w:left="120" w:right="120"/>
-      </w:pPr>
-      <w:r>
-        <w:rPr>
-          <w:rFonts w:ascii="Consolas" w:cs="Consolas" w:eastAsia="Consolas" w:hAnsi="Consolas"/>
-          <w:color w:val="F1F5F9"/>
-          <w:sz w:val="18"/>
-          <w:szCs w:val="18"/>
-        </w:rPr>
-        <w:t xml:space="preserve">mean(d$Abo == "Premium")          # Anteil Premium</w:t>
-      </w:r>
-    </w:p>
-    <w:p>
-      <w:pPr>
-        <w:keepNext/>
-        <w:keepLines/>
-        <w:shd w:fill="1E293B" w:color="auto" w:val="clear"/>
-        <w:spacing w:after="0" w:before="0" w:line="260"/>
-        <w:ind w:left="120" w:right="120"/>
-      </w:pPr>
-      <w:r>
-        <w:rPr>
-          <w:rFonts w:ascii="Consolas" w:cs="Consolas" w:eastAsia="Consolas" w:hAnsi="Consolas"/>
-          <w:color w:val="F1F5F9"/>
-          <w:sz w:val="18"/>
-          <w:szCs w:val="18"/>
-        </w:rPr>
-        <w:t xml:space="preserve">d &lt;- d[order(d$Minuten), ]        # nach Minuten sortieren</w:t>
+        <w:t xml:space="preserve">d[d$Mensa == "Nord", ]           # nur Zeilen der Mensa Nord</w:t>
+      </w:r>
+    </w:p>
+    <w:p>
+      <w:pPr>
+        <w:keepNext/>
+        <w:keepLines/>
+        <w:shd w:fill="1E293B" w:color="auto" w:val="clear"/>
+        <w:spacing w:after="0" w:before="0" w:line="260"/>
+        <w:ind w:left="120" w:right="120"/>
+      </w:pPr>
+      <w:r>
+        <w:rPr>
+          <w:rFonts w:ascii="Consolas" w:cs="Consolas" w:eastAsia="Consolas" w:hAnsi="Consolas"/>
+          <w:color w:val="F1F5F9"/>
+          <w:sz w:val="18"/>
+          <w:szCs w:val="18"/>
+        </w:rPr>
+        <w:t xml:space="preserve">subset(d, Typ == "Mitarbeiter" &amp; Dauer &gt; 40)</w:t>
+      </w:r>
+    </w:p>
+    <w:p>
+      <w:pPr>
+        <w:keepNext/>
+        <w:keepLines/>
+        <w:shd w:fill="1E293B" w:color="auto" w:val="clear"/>
+        <w:spacing w:after="0" w:before="0" w:line="260"/>
+        <w:ind w:left="120" w:right="120"/>
+      </w:pPr>
+      <w:r>
+        <w:rPr>
+          <w:rFonts w:ascii="Consolas" w:cs="Consolas" w:eastAsia="Consolas" w:hAnsi="Consolas"/>
+          <w:color w:val="F1F5F9"/>
+          <w:sz w:val="18"/>
+          <w:szCs w:val="18"/>
+        </w:rPr>
+        <w:t xml:space="preserve">d$Stunden &lt;- d$Dauer / 60       # neue Spalte</w:t>
+      </w:r>
+    </w:p>
+    <w:p>
+      <w:pPr>
+        <w:keepNext/>
+        <w:keepLines/>
+        <w:shd w:fill="1E293B" w:color="auto" w:val="clear"/>
+        <w:spacing w:after="0" w:before="0" w:line="260"/>
+        <w:ind w:left="120" w:right="120"/>
+      </w:pPr>
+      <w:r>
+        <w:rPr>
+          <w:rFonts w:ascii="Consolas" w:cs="Consolas" w:eastAsia="Consolas" w:hAnsi="Consolas"/>
+          <w:color w:val="F1F5F9"/>
+          <w:sz w:val="18"/>
+          <w:szCs w:val="18"/>
+        </w:rPr>
+        <w:t xml:space="preserve">d$lang &lt;- ifelse(d$Dauer &gt; 40, "ja", "nein")</w:t>
+      </w:r>
+    </w:p>
+    <w:p>
+      <w:pPr>
+        <w:keepNext/>
+        <w:keepLines/>
+        <w:shd w:fill="1E293B" w:color="auto" w:val="clear"/>
+        <w:spacing w:after="0" w:before="0" w:line="260"/>
+        <w:ind w:left="120" w:right="120"/>
+      </w:pPr>
+      <w:r>
+        <w:rPr>
+          <w:rFonts w:ascii="Consolas" w:cs="Consolas" w:eastAsia="Consolas" w:hAnsi="Consolas"/>
+          <w:color w:val="F1F5F9"/>
+          <w:sz w:val="18"/>
+          <w:szCs w:val="18"/>
+        </w:rPr>
+        <w:t xml:space="preserve">mean(d$Dauer[d$Typ == "Student"])      # Mittel einer Teilgruppe</w:t>
+      </w:r>
+    </w:p>
+    <w:p>
+      <w:pPr>
+        <w:keepNext/>
+        <w:keepLines/>
+        <w:shd w:fill="1E293B" w:color="auto" w:val="clear"/>
+        <w:spacing w:after="0" w:before="0" w:line="260"/>
+        <w:ind w:left="120" w:right="120"/>
+      </w:pPr>
+      <w:r>
+        <w:rPr>
+          <w:rFonts w:ascii="Consolas" w:cs="Consolas" w:eastAsia="Consolas" w:hAnsi="Consolas"/>
+          <w:color w:val="F1F5F9"/>
+          <w:sz w:val="18"/>
+          <w:szCs w:val="18"/>
+        </w:rPr>
+        <w:t xml:space="preserve">sum(d$Typ == "Student")           # Anzahl Studierende (TRUE zählt 1)</w:t>
+      </w:r>
+    </w:p>
+    <w:p>
+      <w:pPr>
+        <w:keepNext/>
+        <w:keepLines/>
+        <w:shd w:fill="1E293B" w:color="auto" w:val="clear"/>
+        <w:spacing w:after="0" w:before="0" w:line="260"/>
+        <w:ind w:left="120" w:right="120"/>
+      </w:pPr>
+      <w:r>
+        <w:rPr>
+          <w:rFonts w:ascii="Consolas" w:cs="Consolas" w:eastAsia="Consolas" w:hAnsi="Consolas"/>
+          <w:color w:val="F1F5F9"/>
+          <w:sz w:val="18"/>
+          <w:szCs w:val="18"/>
+        </w:rPr>
+        <w:t xml:space="preserve">mean(d$Typ == "Student")          # Anteil Studierende</w:t>
+      </w:r>
+    </w:p>
+    <w:p>
+      <w:pPr>
+        <w:keepNext/>
+        <w:keepLines/>
+        <w:shd w:fill="1E293B" w:color="auto" w:val="clear"/>
+        <w:spacing w:after="0" w:before="0" w:line="260"/>
+        <w:ind w:left="120" w:right="120"/>
+      </w:pPr>
+      <w:r>
+        <w:rPr>
+          <w:rFonts w:ascii="Consolas" w:cs="Consolas" w:eastAsia="Consolas" w:hAnsi="Consolas"/>
+          <w:color w:val="F1F5F9"/>
+          <w:sz w:val="18"/>
+          <w:szCs w:val="18"/>
+        </w:rPr>
+        <w:t xml:space="preserve">d &lt;- d[order(d$Dauer), ]        # nach Dauer sortieren</w:t>
       </w:r>
     </w:p>
     <w:p>
@@ -4383,7 +4420,7 @@
                 <w:sz w:val="20"/>
                 <w:szCs w:val="20"/>
               </w:rPr>
-              <w:t xml:space="preserve">tapply(d$Minuten, d$Studio, mean)</w:t>
+              <w:t xml:space="preserve">tapply(d$Dauer, d$Mensa, mean)</w:t>
             </w:r>
           </w:p>
         </w:tc>
@@ -4410,7 +4447,7 @@
                 <w:sz w:val="20"/>
                 <w:szCs w:val="20"/>
               </w:rPr>
-              <w:t xml:space="preserve">oder aggregate(Minuten ~ Studio, data = d, FUN = mean)</w:t>
+              <w:t xml:space="preserve">oder aggregate(Dauer ~ Mensa, data = d, FUN = mean)</w:t>
             </w:r>
           </w:p>
         </w:tc>
@@ -4522,7 +4559,7 @@
           <w:sz w:val="18"/>
           <w:szCs w:val="18"/>
         </w:rPr>
-        <w:t xml:space="preserve">round(mean(d$Minuten), 3)</w:t>
+        <w:t xml:space="preserve">round(mean(d$Dauer), 3)</w:t>
       </w:r>
     </w:p>
     <w:p>
@@ -4540,25 +4577,25 @@
           <w:sz w:val="18"/>
           <w:szCs w:val="18"/>
         </w:rPr>
-        <w:t xml:space="preserve">[1] 68.275</w:t>
-      </w:r>
-    </w:p>
-    <w:p>
-      <w:pPr>
-        <w:keepNext/>
-        <w:keepLines/>
-        <w:shd w:fill="1E293B" w:color="auto" w:val="clear"/>
-        <w:spacing w:after="0" w:before="0" w:line="260"/>
-        <w:ind w:left="120" w:right="120"/>
-      </w:pPr>
-      <w:r>
-        <w:rPr>
-          <w:rFonts w:ascii="Consolas" w:cs="Consolas" w:eastAsia="Consolas" w:hAnsi="Consolas"/>
-          <w:color w:val="F1F5F9"/>
-          <w:sz w:val="18"/>
-          <w:szCs w:val="18"/>
-        </w:rPr>
-        <w:t xml:space="preserve">round(sd(d$Minuten), 3)</w:t>
+        <w:t xml:space="preserve">[1] 30.637</w:t>
+      </w:r>
+    </w:p>
+    <w:p>
+      <w:pPr>
+        <w:keepNext/>
+        <w:keepLines/>
+        <w:shd w:fill="1E293B" w:color="auto" w:val="clear"/>
+        <w:spacing w:after="0" w:before="0" w:line="260"/>
+        <w:ind w:left="120" w:right="120"/>
+      </w:pPr>
+      <w:r>
+        <w:rPr>
+          <w:rFonts w:ascii="Consolas" w:cs="Consolas" w:eastAsia="Consolas" w:hAnsi="Consolas"/>
+          <w:color w:val="F1F5F9"/>
+          <w:sz w:val="18"/>
+          <w:szCs w:val="18"/>
+        </w:rPr>
+        <w:t xml:space="preserve">round(sd(d$Dauer), 3)</w:t>
       </w:r>
     </w:p>
     <w:p>
@@ -4576,25 +4613,61 @@
           <w:sz w:val="18"/>
           <w:szCs w:val="18"/>
         </w:rPr>
-        <w:t xml:space="preserve">[1] 13.807</w:t>
-      </w:r>
-    </w:p>
-    <w:p>
-      <w:pPr>
-        <w:keepNext/>
-        <w:keepLines/>
-        <w:shd w:fill="1E293B" w:color="auto" w:val="clear"/>
-        <w:spacing w:after="0" w:before="0" w:line="260"/>
-        <w:ind w:left="120" w:right="120"/>
-      </w:pPr>
-      <w:r>
-        <w:rPr>
-          <w:rFonts w:ascii="Consolas" w:cs="Consolas" w:eastAsia="Consolas" w:hAnsi="Consolas"/>
-          <w:color w:val="F1F5F9"/>
-          <w:sz w:val="18"/>
-          <w:szCs w:val="18"/>
-        </w:rPr>
-        <w:t xml:space="preserve">tapply(d$Minuten, d$Studio, median)</w:t>
+        <w:t xml:space="preserve">[1] 7.651</w:t>
+      </w:r>
+    </w:p>
+    <w:p>
+      <w:pPr>
+        <w:keepNext/>
+        <w:keepLines/>
+        <w:shd w:fill="1E293B" w:color="auto" w:val="clear"/>
+        <w:spacing w:after="0" w:before="0" w:line="260"/>
+        <w:ind w:left="120" w:right="120"/>
+      </w:pPr>
+      <w:r>
+        <w:rPr>
+          <w:rFonts w:ascii="Consolas" w:cs="Consolas" w:eastAsia="Consolas" w:hAnsi="Consolas"/>
+          <w:color w:val="F1F5F9"/>
+          <w:sz w:val="18"/>
+          <w:szCs w:val="18"/>
+        </w:rPr>
+        <w:t xml:space="preserve">tapply(d$Dauer, d$Mensa, median)</w:t>
+      </w:r>
+    </w:p>
+    <w:p>
+      <w:pPr>
+        <w:keepNext/>
+        <w:keepLines/>
+        <w:shd w:fill="1E293B" w:color="auto" w:val="clear"/>
+        <w:spacing w:after="0" w:before="0" w:line="260"/>
+        <w:ind w:left="120" w:right="120"/>
+      </w:pPr>
+      <w:r>
+        <w:rPr>
+          <w:rFonts w:ascii="Consolas" w:cs="Consolas" w:eastAsia="Consolas" w:hAnsi="Consolas"/>
+          <w:color w:val="F1F5F9"/>
+          <w:sz w:val="18"/>
+          <w:szCs w:val="18"/>
+        </w:rPr>
+        <w:t xml:space="preserve">   Nord    Turm Zentral</w:t>
+      </w:r>
+    </w:p>
+    <w:p>
+      <w:pPr>
+        <w:keepNext/>
+        <w:keepLines/>
+        <w:shd w:fill="1E293B" w:color="auto" w:val="clear"/>
+        <w:spacing w:after="0" w:before="0" w:line="260"/>
+        <w:ind w:left="120" w:right="120"/>
+      </w:pPr>
+      <w:r>
+        <w:rPr>
+          <w:rFonts w:ascii="Consolas" w:cs="Consolas" w:eastAsia="Consolas" w:hAnsi="Consolas"/>
+          <w:color w:val="F1F5F9"/>
+          <w:sz w:val="18"/>
+          <w:szCs w:val="18"/>
+        </w:rPr>
+        <w:t xml:space="preserve">   31.5    29.0    33.0</w:t>
       </w:r>
     </w:p>
     <w:p>
@@ -4612,7 +4685,7 @@
           <w:sz w:val="18"/>
           <w:szCs w:val="18"/>
         </w:rPr>
-        <w:t xml:space="preserve">round(quantile(d$Minuten, c(0.25, 0.5, 0.75)), 3)</w:t>
+        <w:t xml:space="preserve">round(quantile(d$Dauer, c(0.25, 0.5, 0.75)), 3)</w:t>
       </w:r>
     </w:p>
     <w:p>
@@ -4635,7 +4708,7 @@
         <w:t xml:space="preserve">✎ ANTWORTSATZ: </w:t>
       </w:r>
       <w:r>
-        <w:t xml:space="preserve">„Das arithmetische Mittel der Variable Minuten beträgt 68.275. Der unverzerrte Schätzer für die Standardabweichung beträgt 13.807.“</w:t>
+        <w:t xml:space="preserve">„Das arithmetische Mittel der Variable Dauer beträgt 30.637. Der unverzerrte Schätzer für die Standardabweichung beträgt 7.651.“</w:t>
       </w:r>
     </w:p>
     <w:p>
@@ -4940,6 +5013,131 @@
     </w:p>
     <w:p>
       <w:pPr>
+        <w:keepNext/>
+        <w:keepLines/>
+        <w:pBdr>
+          <w:left w:val="single" w:color="7C5CD6" w:sz="24" w:space="6"/>
+        </w:pBdr>
+        <w:shd w:fill="F1EBFF" w:color="auto" w:val="clear"/>
+        <w:spacing w:after="0" w:before="80"/>
+        <w:ind w:left="120" w:right="120"/>
+      </w:pPr>
+      <w:r>
+        <w:rPr>
+          <w:b/>
+          <w:bCs/>
+          <w:color w:val="3B2A7A"/>
+        </w:rPr>
+        <w:t xml:space="preserve">BEISPIEL: Grafik-Teilaufgabe in 5 Schritten</w:t>
+      </w:r>
+    </w:p>
+    <w:p>
+      <w:pPr>
+        <w:keepNext/>
+        <w:keepLines/>
+        <w:pBdr>
+          <w:left w:val="single" w:color="7C5CD6" w:sz="24" w:space="6"/>
+        </w:pBdr>
+        <w:shd w:fill="F1EBFF" w:color="auto" w:val="clear"/>
+        <w:spacing w:after="0" w:before="0"/>
+        <w:ind w:left="120" w:right="120"/>
+      </w:pPr>
+      <w:r>
+        <w:t xml:space="preserve">Typische Aufgabe: „Erstellen Sie ein Histogramm … Titel … Achsen … speichern Sie als Histogramm.pdf und laden Sie die Datei hoch.“</w:t>
+      </w:r>
+    </w:p>
+    <w:p>
+      <w:pPr>
+        <w:keepNext/>
+        <w:keepLines/>
+        <w:pBdr>
+          <w:left w:val="single" w:color="7C5CD6" w:sz="24" w:space="6"/>
+        </w:pBdr>
+        <w:shd w:fill="F1EBFF" w:color="auto" w:val="clear"/>
+        <w:spacing w:after="0" w:before="0"/>
+        <w:ind w:left="120" w:right="120"/>
+      </w:pPr>
+      <w:r>
+        <w:t xml:space="preserve">1) pdf("Histogramm.pdf") – Datei mit genau dem verlangten Namen öffnen.</w:t>
+      </w:r>
+    </w:p>
+    <w:p>
+      <w:pPr>
+        <w:keepNext/>
+        <w:keepLines/>
+        <w:pBdr>
+          <w:left w:val="single" w:color="7C5CD6" w:sz="24" w:space="6"/>
+        </w:pBdr>
+        <w:shd w:fill="F1EBFF" w:color="auto" w:val="clear"/>
+        <w:spacing w:after="0" w:before="0"/>
+        <w:ind w:left="120" w:right="120"/>
+      </w:pPr>
+      <w:r>
+        <w:t xml:space="preserve">2) Grafikbefehl mit allen Pflichtangaben: Daten, breaks, right = FALSE, freq = FALSE.</w:t>
+      </w:r>
+    </w:p>
+    <w:p>
+      <w:pPr>
+        <w:keepNext/>
+        <w:keepLines/>
+        <w:pBdr>
+          <w:left w:val="single" w:color="7C5CD6" w:sz="24" w:space="6"/>
+        </w:pBdr>
+        <w:shd w:fill="F1EBFF" w:color="auto" w:val="clear"/>
+        <w:spacing w:after="0" w:before="0"/>
+        <w:ind w:left="120" w:right="120"/>
+      </w:pPr>
+      <w:r>
+        <w:t xml:space="preserve">3) main = "Sitz …, Matr.Nr. …, Aufgabenteil e)", xlab und ylab exakt wie in der Aufgabe.</w:t>
+      </w:r>
+    </w:p>
+    <w:p>
+      <w:pPr>
+        <w:keepNext/>
+        <w:keepLines/>
+        <w:pBdr>
+          <w:left w:val="single" w:color="7C5CD6" w:sz="24" w:space="6"/>
+        </w:pBdr>
+        <w:shd w:fill="F1EBFF" w:color="auto" w:val="clear"/>
+        <w:spacing w:after="0" w:before="0"/>
+        <w:ind w:left="120" w:right="120"/>
+      </w:pPr>
+      <w:r>
+        <w:t xml:space="preserve">4) dev.off() – Datei schließen.</w:t>
+      </w:r>
+    </w:p>
+    <w:p>
+      <w:pPr>
+        <w:keepNext/>
+        <w:keepLines/>
+        <w:pBdr>
+          <w:left w:val="single" w:color="7C5CD6" w:sz="24" w:space="6"/>
+        </w:pBdr>
+        <w:shd w:fill="F1EBFF" w:color="auto" w:val="clear"/>
+        <w:spacing w:after="0" w:before="0"/>
+        <w:ind w:left="120" w:right="120"/>
+      </w:pPr>
+      <w:r>
+        <w:t xml:space="preserve">5) Code + Output nach ILIAS kopieren und die PDF-Datei hochladen.</w:t>
+      </w:r>
+    </w:p>
+    <w:p>
+      <w:pPr>
+        <w:keepNext w:val="false"/>
+        <w:keepLines/>
+        <w:pBdr>
+          <w:left w:val="single" w:color="7C5CD6" w:sz="24" w:space="6"/>
+        </w:pBdr>
+        <w:shd w:fill="F1EBFF" w:color="auto" w:val="clear"/>
+        <w:spacing w:after="100" w:before="0"/>
+        <w:ind w:left="120" w:right="120"/>
+      </w:pPr>
+      <w:r>
+        <w:t xml:space="preserve">⇒ Jeder Schritt ist ein eigener Bewertungspunkt – nichts weglassen!</w:t>
+      </w:r>
+    </w:p>
+    <w:p>
+      <w:pPr>
         <w:keepNext w:val="false"/>
         <w:keepLines/>
         <w:pBdr>
@@ -5015,7 +5213,7 @@
           <w:sz w:val="18"/>
           <w:szCs w:val="18"/>
         </w:rPr>
-        <w:t xml:space="preserve">boxplot(Minuten ~ Studio, data = d,</w:t>
+        <w:t xml:space="preserve">boxplot(Dauer ~ Mensa, data = d,</w:t>
       </w:r>
     </w:p>
     <w:p>
@@ -5051,7 +5249,7 @@
           <w:sz w:val="18"/>
           <w:szCs w:val="18"/>
         </w:rPr>
-        <w:t xml:space="preserve">        xlab = "Studio", ylab = "Trainingsdauer in Minuten")</w:t>
+        <w:t xml:space="preserve">        xlab = "Mensa", ylab = "Aufenthaltsdauer in Minuten")</w:t>
       </w:r>
     </w:p>
     <w:p>
@@ -5087,7 +5285,7 @@
           <w:sz w:val="18"/>
           <w:szCs w:val="18"/>
         </w:rPr>
-        <w:t xml:space="preserve">boxplot(d$Minuten, horizontal = TRUE)   # ein einzelner Boxplot</w:t>
+        <w:t xml:space="preserve">boxplot(d$Dauer, horizontal = TRUE)   # ein einzelner Boxplot</w:t>
       </w:r>
     </w:p>
     <w:p>
@@ -5126,7 +5324,7 @@
           <w:sz w:val="18"/>
           <w:szCs w:val="18"/>
         </w:rPr>
-        <w:t xml:space="preserve">plot(d$Minuten, d$Wartezeit, xlab = "…", ylab = "…", main = "…")   # Streudiagramm</w:t>
+        <w:t xml:space="preserve">plot(d$Dauer, d$Wartezeit, xlab = "…", ylab = "…", main = "…")   # Streudiagramm</w:t>
       </w:r>
     </w:p>
     <w:p>
@@ -5162,79 +5360,79 @@
           <w:sz w:val="18"/>
           <w:szCs w:val="18"/>
         </w:rPr>
-        <w:t xml:space="preserve">barplot(table(d$Studio), main = "…", xlab = "Studio", ylab = "Anzahl")</w:t>
-      </w:r>
-    </w:p>
-    <w:p>
-      <w:pPr>
-        <w:keepNext/>
-        <w:keepLines/>
-        <w:shd w:fill="1E293B" w:color="auto" w:val="clear"/>
-        <w:spacing w:after="0" w:before="0" w:line="260"/>
-        <w:ind w:left="120" w:right="120"/>
-      </w:pPr>
-      <w:r>
-        <w:rPr>
-          <w:rFonts w:ascii="Consolas" w:cs="Consolas" w:eastAsia="Consolas" w:hAnsi="Consolas"/>
-          <w:color w:val="F1F5F9"/>
-          <w:sz w:val="18"/>
-          <w:szCs w:val="18"/>
-        </w:rPr>
-        <w:t xml:space="preserve">plot(ecdf(d$Minuten), main = "…", xlab = "…", ylab = "F(x)")      # empirische Verteilungsfunktion</w:t>
-      </w:r>
-    </w:p>
-    <w:p>
-      <w:pPr>
-        <w:keepNext/>
-        <w:keepLines/>
-        <w:shd w:fill="1E293B" w:color="auto" w:val="clear"/>
-        <w:spacing w:after="0" w:before="0" w:line="260"/>
-        <w:ind w:left="120" w:right="120"/>
-      </w:pPr>
-      <w:r>
-        <w:rPr>
-          <w:rFonts w:ascii="Consolas" w:cs="Consolas" w:eastAsia="Consolas" w:hAnsi="Consolas"/>
-          <w:color w:val="F1F5F9"/>
-          <w:sz w:val="18"/>
-          <w:szCs w:val="18"/>
-        </w:rPr>
-        <w:t xml:space="preserve">plot(density(d$Minuten), main = "…")                              # Kerndichteschätzer</w:t>
-      </w:r>
-    </w:p>
-    <w:p>
-      <w:pPr>
-        <w:keepNext/>
-        <w:keepLines/>
-        <w:shd w:fill="1E293B" w:color="auto" w:val="clear"/>
-        <w:spacing w:after="0" w:before="0" w:line="260"/>
-        <w:ind w:left="120" w:right="120"/>
-      </w:pPr>
-      <w:r>
-        <w:rPr>
-          <w:rFonts w:ascii="Consolas" w:cs="Consolas" w:eastAsia="Consolas" w:hAnsi="Consolas"/>
-          <w:color w:val="F1F5F9"/>
-          <w:sz w:val="18"/>
-          <w:szCs w:val="18"/>
-        </w:rPr>
-        <w:t xml:space="preserve">curve(dnorm(x, 68, 14), from = 30, to = 110, add = TRUE, col = "blue")  # Dichte darüber</w:t>
-      </w:r>
-    </w:p>
-    <w:p>
-      <w:pPr>
-        <w:keepNext/>
-        <w:keepLines/>
-        <w:shd w:fill="1E293B" w:color="auto" w:val="clear"/>
-        <w:spacing w:after="0" w:before="0" w:line="260"/>
-        <w:ind w:left="120" w:right="120"/>
-      </w:pPr>
-      <w:r>
-        <w:rPr>
-          <w:rFonts w:ascii="Consolas" w:cs="Consolas" w:eastAsia="Consolas" w:hAnsi="Consolas"/>
-          <w:color w:val="F1F5F9"/>
-          <w:sz w:val="18"/>
-          <w:szCs w:val="18"/>
-        </w:rPr>
-        <w:t xml:space="preserve">lines(density(d$Minuten), col = "red")                            # Linie zu bestehendem Plot</w:t>
+        <w:t xml:space="preserve">barplot(table(d$Mensa), main = "…", xlab = "Mensa", ylab = "Anzahl")</w:t>
+      </w:r>
+    </w:p>
+    <w:p>
+      <w:pPr>
+        <w:keepNext/>
+        <w:keepLines/>
+        <w:shd w:fill="1E293B" w:color="auto" w:val="clear"/>
+        <w:spacing w:after="0" w:before="0" w:line="260"/>
+        <w:ind w:left="120" w:right="120"/>
+      </w:pPr>
+      <w:r>
+        <w:rPr>
+          <w:rFonts w:ascii="Consolas" w:cs="Consolas" w:eastAsia="Consolas" w:hAnsi="Consolas"/>
+          <w:color w:val="F1F5F9"/>
+          <w:sz w:val="18"/>
+          <w:szCs w:val="18"/>
+        </w:rPr>
+        <w:t xml:space="preserve">plot(ecdf(d$Dauer), main = "…", xlab = "…", ylab = "F(x)")      # empirische Verteilungsfunktion</w:t>
+      </w:r>
+    </w:p>
+    <w:p>
+      <w:pPr>
+        <w:keepNext/>
+        <w:keepLines/>
+        <w:shd w:fill="1E293B" w:color="auto" w:val="clear"/>
+        <w:spacing w:after="0" w:before="0" w:line="260"/>
+        <w:ind w:left="120" w:right="120"/>
+      </w:pPr>
+      <w:r>
+        <w:rPr>
+          <w:rFonts w:ascii="Consolas" w:cs="Consolas" w:eastAsia="Consolas" w:hAnsi="Consolas"/>
+          <w:color w:val="F1F5F9"/>
+          <w:sz w:val="18"/>
+          <w:szCs w:val="18"/>
+        </w:rPr>
+        <w:t xml:space="preserve">plot(density(d$Dauer), main = "…")                              # Kerndichteschätzer</w:t>
+      </w:r>
+    </w:p>
+    <w:p>
+      <w:pPr>
+        <w:keepNext/>
+        <w:keepLines/>
+        <w:shd w:fill="1E293B" w:color="auto" w:val="clear"/>
+        <w:spacing w:after="0" w:before="0" w:line="260"/>
+        <w:ind w:left="120" w:right="120"/>
+      </w:pPr>
+      <w:r>
+        <w:rPr>
+          <w:rFonts w:ascii="Consolas" w:cs="Consolas" w:eastAsia="Consolas" w:hAnsi="Consolas"/>
+          <w:color w:val="F1F5F9"/>
+          <w:sz w:val="18"/>
+          <w:szCs w:val="18"/>
+        </w:rPr>
+        <w:t xml:space="preserve">curve(dnorm(x, 31, 8), from = 5, to = 60, add = TRUE, col = "blue")  # Dichte darüber</w:t>
+      </w:r>
+    </w:p>
+    <w:p>
+      <w:pPr>
+        <w:keepNext/>
+        <w:keepLines/>
+        <w:shd w:fill="1E293B" w:color="auto" w:val="clear"/>
+        <w:spacing w:after="0" w:before="0" w:line="260"/>
+        <w:ind w:left="120" w:right="120"/>
+      </w:pPr>
+      <w:r>
+        <w:rPr>
+          <w:rFonts w:ascii="Consolas" w:cs="Consolas" w:eastAsia="Consolas" w:hAnsi="Consolas"/>
+          <w:color w:val="F1F5F9"/>
+          <w:sz w:val="18"/>
+          <w:szCs w:val="18"/>
+        </w:rPr>
+        <w:t xml:space="preserve">lines(density(d$Dauer), col = "red")                            # Linie zu bestehendem Plot</w:t>
       </w:r>
     </w:p>
     <w:p>
@@ -5345,7 +5543,7 @@
           <w:sz w:val="18"/>
           <w:szCs w:val="18"/>
         </w:rPr>
-        <w:t xml:space="preserve">tab &lt;- table(d$Studio, d$Abo)          # Kontingenztabelle (absolut)</w:t>
+        <w:t xml:space="preserve">tab &lt;- table(d$Mensa, d$Typ)          # Kontingenztabelle (absolut)</w:t>
       </w:r>
     </w:p>
     <w:p>
@@ -5417,7 +5615,7 @@
           <w:sz w:val="18"/>
           <w:szCs w:val="18"/>
         </w:rPr>
-        <w:t xml:space="preserve">round(prop.table(tab, margin = 1), 3)  # zeilenweise: Anteil je Studio</w:t>
+        <w:t xml:space="preserve">round(prop.table(tab, margin = 1), 3)  # zeilenweise: Anteil je Mensa</w:t>
       </w:r>
     </w:p>
     <w:p>
@@ -5650,7 +5848,7 @@
         <w:ind w:left="120" w:right="120"/>
       </w:pPr>
       <w:r>
-        <w:t xml:space="preserve">„Im Studio Nord ist der Anteil der Premium-Mitglieder mit 0.533 am höchsten.“</w:t>
+        <w:t xml:space="preserve">„In der Mensa Turm ist der Anteil der Mitarbeitenden mit 0.440 am höchsten.“</w:t>
       </w:r>
     </w:p>
     <w:p>
@@ -7265,25 +7463,25 @@
           <w:sz w:val="18"/>
           <w:szCs w:val="18"/>
         </w:rPr>
-        <w:t xml:space="preserve">d$iL04 &lt;- dexp(d$Wartezeit, rate = 0.4)   # stetig: Dichte</w:t>
-      </w:r>
-    </w:p>
-    <w:p>
-      <w:pPr>
-        <w:keepNext/>
-        <w:keepLines/>
-        <w:shd w:fill="1E293B" w:color="auto" w:val="clear"/>
-        <w:spacing w:after="0" w:before="0" w:line="260"/>
-        <w:ind w:left="120" w:right="120"/>
-      </w:pPr>
-      <w:r>
-        <w:rPr>
-          <w:rFonts w:ascii="Consolas" w:cs="Consolas" w:eastAsia="Consolas" w:hAnsi="Consolas"/>
-          <w:color w:val="F1F5F9"/>
-          <w:sz w:val="18"/>
-          <w:szCs w:val="18"/>
-        </w:rPr>
-        <w:t xml:space="preserve">d$iL2  &lt;- dpois(d$Buecher, lambda = 2)    # diskret: Wahrscheinlichkeitsfunktion</w:t>
+        <w:t xml:space="preserve">d$iL02 &lt;- dexp(d$Wartezeit, rate = 0.2)   # stetig: Dichte</w:t>
+      </w:r>
+    </w:p>
+    <w:p>
+      <w:pPr>
+        <w:keepNext/>
+        <w:keepLines/>
+        <w:shd w:fill="1E293B" w:color="auto" w:val="clear"/>
+        <w:spacing w:after="0" w:before="0" w:line="260"/>
+        <w:ind w:left="120" w:right="120"/>
+      </w:pPr>
+      <w:r>
+        <w:rPr>
+          <w:rFonts w:ascii="Consolas" w:cs="Consolas" w:eastAsia="Consolas" w:hAnsi="Consolas"/>
+          <w:color w:val="F1F5F9"/>
+          <w:sz w:val="18"/>
+          <w:szCs w:val="18"/>
+        </w:rPr>
+        <w:t xml:space="preserve">d$iL15 &lt;- dpois(d$Gerichte, lambda = 1.5) # diskret: Wahrscheinlichkeitsfunktion</w:t>
       </w:r>
     </w:p>
     <w:p>
@@ -7319,7 +7517,7 @@
           <w:sz w:val="18"/>
           <w:szCs w:val="18"/>
         </w:rPr>
-        <w:t xml:space="preserve">L &lt;- prod(d$iL04)                         # Likelihood = Produkt</w:t>
+        <w:t xml:space="preserve">L &lt;- prod(d$iL02)                         # Likelihood = Produkt</w:t>
       </w:r>
     </w:p>
     <w:p>
@@ -7355,25 +7553,25 @@
           <w:sz w:val="18"/>
           <w:szCs w:val="18"/>
         </w:rPr>
-        <w:t xml:space="preserve">[1] 8.31605e-64</w:t>
-      </w:r>
-    </w:p>
-    <w:p>
-      <w:pPr>
-        <w:keepNext/>
-        <w:keepLines/>
-        <w:shd w:fill="1E293B" w:color="auto" w:val="clear"/>
-        <w:spacing w:after="0" w:before="0" w:line="260"/>
-        <w:ind w:left="120" w:right="120"/>
-      </w:pPr>
-      <w:r>
-        <w:rPr>
-          <w:rFonts w:ascii="Consolas" w:cs="Consolas" w:eastAsia="Consolas" w:hAnsi="Consolas"/>
-          <w:color w:val="F1F5F9"/>
-          <w:sz w:val="18"/>
-          <w:szCs w:val="18"/>
-        </w:rPr>
-        <w:t xml:space="preserve">format(L, scientific = TRUE, digits = 4)  # 8.316e-64  -&gt;  8.316 × 10^(-64)</w:t>
+        <w:t xml:space="preserve">[1] 1.690527e-89</w:t>
+      </w:r>
+    </w:p>
+    <w:p>
+      <w:pPr>
+        <w:keepNext/>
+        <w:keepLines/>
+        <w:shd w:fill="1E293B" w:color="auto" w:val="clear"/>
+        <w:spacing w:after="0" w:before="0" w:line="260"/>
+        <w:ind w:left="120" w:right="120"/>
+      </w:pPr>
+      <w:r>
+        <w:rPr>
+          <w:rFonts w:ascii="Consolas" w:cs="Consolas" w:eastAsia="Consolas" w:hAnsi="Consolas"/>
+          <w:color w:val="F1F5F9"/>
+          <w:sz w:val="18"/>
+          <w:szCs w:val="18"/>
+        </w:rPr>
+        <w:t xml:space="preserve">format(L, scientific = TRUE, digits = 4)  # 1.691e-89  -&gt;  1.691 × 10^(-89)</w:t>
       </w:r>
     </w:p>
     <w:p>
@@ -7391,7 +7589,7 @@
           <w:sz w:val="18"/>
           <w:szCs w:val="18"/>
         </w:rPr>
-        <w:t xml:space="preserve">logL &lt;- sum(log(d$iL04))                  # Log-Likelihood = Summe der Logs</w:t>
+        <w:t xml:space="preserve">logL &lt;- sum(log(d$iL02))                  # Log-Likelihood = Summe der Logs</w:t>
       </w:r>
     </w:p>
     <w:p>
@@ -7414,7 +7612,7 @@
         <w:t xml:space="preserve">✎ ANTWORTSATZ: </w:t>
       </w:r>
       <w:r>
-        <w:t xml:space="preserve">„Unter der Annahme λ = 0.4 beträgt die Likelihood aller Beobachtungen L(λ = 0.4) = 8.316 × 10^(−64).“</w:t>
+        <w:t xml:space="preserve">„Unter der Annahme λ = 0.2 beträgt die Likelihood aller Beobachtungen L(λ = 0.2) = 1.691 × 10^(−89).“</w:t>
       </w:r>
     </w:p>
     <w:p>
@@ -7437,7 +7635,7 @@
         <w:t xml:space="preserve">⚠ FALLE: </w:t>
       </w:r>
       <w:r>
-        <w:t xml:space="preserve">Darstellung X × 10^Y: aus 8.31605e-64 wird 8.316 × 10^(−64) – X auf 3 Nachkommastellen, Y ganze Zahl (hier negativ!).</w:t>
+        <w:t xml:space="preserve">Darstellung X × 10^Y: aus 1.690527e-89 wird 1.691 × 10^(−89) – X auf 3 Nachkommastellen, Y ganze Zahl (hier negativ!).</w:t>
       </w:r>
     </w:p>
     <w:p>
@@ -7548,7 +7746,7 @@
           <w:sz w:val="18"/>
           <w:szCs w:val="18"/>
         </w:rPr>
-        <w:t xml:space="preserve">lam &lt;- seq(0.30, 0.60, by = 0.05)</w:t>
+        <w:t xml:space="preserve">lam &lt;- seq(0.15, 0.35, by = 0.05)</w:t>
       </w:r>
     </w:p>
     <w:p>
@@ -7620,7 +7818,7 @@
           <w:sz w:val="18"/>
           <w:szCs w:val="18"/>
         </w:rPr>
-        <w:t xml:space="preserve">[1] 0.45</w:t>
+        <w:t xml:space="preserve">[1] 0.2</w:t>
       </w:r>
     </w:p>
     <w:p>
@@ -7657,6 +7855,116 @@
           <w:szCs w:val="18"/>
         </w:rPr>
         <w:t xml:space="preserve">for (l in lam) print(Likelihood.exp(l, d$Wartezeit))</w:t>
+      </w:r>
+    </w:p>
+    <w:p>
+      <w:pPr>
+        <w:keepNext/>
+        <w:keepLines/>
+        <w:pBdr>
+          <w:left w:val="single" w:color="7C5CD6" w:sz="24" w:space="6"/>
+        </w:pBdr>
+        <w:shd w:fill="F1EBFF" w:color="auto" w:val="clear"/>
+        <w:spacing w:after="0" w:before="80"/>
+        <w:ind w:left="120" w:right="120"/>
+      </w:pPr>
+      <w:r>
+        <w:rPr>
+          <w:b/>
+          <w:bCs/>
+          <w:color w:val="3B2A7A"/>
+        </w:rPr>
+        <w:t xml:space="preserve">BEISPIEL: Likelihood-Aufgabe in 4 Schritten</w:t>
+      </w:r>
+    </w:p>
+    <w:p>
+      <w:pPr>
+        <w:keepNext/>
+        <w:keepLines/>
+        <w:pBdr>
+          <w:left w:val="single" w:color="7C5CD6" w:sz="24" w:space="6"/>
+        </w:pBdr>
+        <w:shd w:fill="F1EBFF" w:color="auto" w:val="clear"/>
+        <w:spacing w:after="0" w:before="0"/>
+        <w:ind w:left="120" w:right="120"/>
+      </w:pPr>
+      <w:r>
+        <w:t xml:space="preserve">Poisson-Daten x &lt;- c(2, 0, 3, 1), Gitter λ ∈ {1, 1.5, 2}.</w:t>
+      </w:r>
+    </w:p>
+    <w:p>
+      <w:pPr>
+        <w:keepNext/>
+        <w:keepLines/>
+        <w:pBdr>
+          <w:left w:val="single" w:color="7C5CD6" w:sz="24" w:space="6"/>
+        </w:pBdr>
+        <w:shd w:fill="F1EBFF" w:color="auto" w:val="clear"/>
+        <w:spacing w:after="0" w:before="0"/>
+        <w:ind w:left="120" w:right="120"/>
+      </w:pPr>
+      <w:r>
+        <w:t xml:space="preserve">1) Individuelle Likelihoods: dpois(x, lambda = 1.5) → 0.251 0.223 0.126 0.335.</w:t>
+      </w:r>
+    </w:p>
+    <w:p>
+      <w:pPr>
+        <w:keepNext/>
+        <w:keepLines/>
+        <w:pBdr>
+          <w:left w:val="single" w:color="7C5CD6" w:sz="24" w:space="6"/>
+        </w:pBdr>
+        <w:shd w:fill="F1EBFF" w:color="auto" w:val="clear"/>
+        <w:spacing w:after="0" w:before="0"/>
+        <w:ind w:left="120" w:right="120"/>
+      </w:pPr>
+      <w:r>
+        <w:t xml:space="preserve">2) Gesamt-Likelihood: prod(dpois(x, 1.5)) = 0.002353 = 2.353 × 10^(−3).</w:t>
+      </w:r>
+    </w:p>
+    <w:p>
+      <w:pPr>
+        <w:keepNext/>
+        <w:keepLines/>
+        <w:pBdr>
+          <w:left w:val="single" w:color="7C5CD6" w:sz="24" w:space="6"/>
+        </w:pBdr>
+        <w:shd w:fill="F1EBFF" w:color="auto" w:val="clear"/>
+        <w:spacing w:after="0" w:before="0"/>
+        <w:ind w:left="120" w:right="120"/>
+      </w:pPr>
+      <w:r>
+        <w:t xml:space="preserve">3) Funktion: Likelihood.pois &lt;- function(lambda, x) prod(dpois(x, lambda)); sapply(c(1, 1.5, 2), Likelihood.pois, x = x).</w:t>
+      </w:r>
+    </w:p>
+    <w:p>
+      <w:pPr>
+        <w:keepNext/>
+        <w:keepLines/>
+        <w:pBdr>
+          <w:left w:val="single" w:color="7C5CD6" w:sz="24" w:space="6"/>
+        </w:pBdr>
+        <w:shd w:fill="F1EBFF" w:color="auto" w:val="clear"/>
+        <w:spacing w:after="0" w:before="0"/>
+        <w:ind w:left="120" w:right="120"/>
+      </w:pPr>
+      <w:r>
+        <w:t xml:space="preserve">4) Maximum: which.max(…) → λ = 1.5; Kontrolle analytisch: mean(x) = 1.5 ✓.</w:t>
+      </w:r>
+    </w:p>
+    <w:p>
+      <w:pPr>
+        <w:keepNext w:val="false"/>
+        <w:keepLines/>
+        <w:pBdr>
+          <w:left w:val="single" w:color="7C5CD6" w:sz="24" w:space="6"/>
+        </w:pBdr>
+        <w:shd w:fill="F1EBFF" w:color="auto" w:val="clear"/>
+        <w:spacing w:after="100" w:before="0"/>
+        <w:ind w:left="120" w:right="120"/>
+      </w:pPr>
+      <w:r>
+        <w:t xml:space="preserve">⇒ ML-Schätzer aus dem Gitter: λ̂ = 1.5</w:t>
       </w:r>
     </w:p>
     <w:p>
@@ -7767,7 +8075,7 @@
           <w:sz w:val="18"/>
           <w:szCs w:val="18"/>
         </w:rPr>
-        <w:t xml:space="preserve">nlm(nll, p = c(60, 10), x = d$Minuten)$estimate</w:t>
+        <w:t xml:space="preserve">nlm(nll, p = c(30, 8), x = d$Dauer)$estimate</w:t>
       </w:r>
     </w:p>
     <w:p>
@@ -8273,7 +8581,7 @@
         <w:t xml:space="preserve">✎ ANTWORTSATZ: </w:t>
       </w:r>
       <w:r>
-        <w:t xml:space="preserve">„Aus der vorgegebenen Menge maximiert λ = 0.45 die Likelihood; der ML-Schätzer ist daher λ̂ = 0.45. Der analytische ML-Schätzer 1/x̄ = 0.445 liegt sehr nahe daran.“</w:t>
+        <w:t xml:space="preserve">„Aus der vorgegebenen Menge maximiert λ = 0.2 die Likelihood; der ML-Schätzer ist daher λ̂ = 0.2. Der analytische ML-Schätzer 1/x̄ = 0.212 liegt sehr nahe daran.“</w:t>
       </w:r>
     </w:p>
     <w:p>
@@ -8696,7 +9004,7 @@
           <w:sz w:val="18"/>
           <w:szCs w:val="18"/>
         </w:rPr>
-        <w:t xml:space="preserve">dens &lt;- density(d$Minuten)                         # Standard: Gauß-Kern</w:t>
+        <w:t xml:space="preserve">dens &lt;- density(d$Dauer)                         # Standard: Gauß-Kern</w:t>
       </w:r>
     </w:p>
     <w:p>
@@ -8732,25 +9040,25 @@
           <w:sz w:val="18"/>
           <w:szCs w:val="18"/>
         </w:rPr>
-        <w:t xml:space="preserve">density(d$Minuten, bw = 5)                         # Bandweite festlegen</w:t>
-      </w:r>
-    </w:p>
-    <w:p>
-      <w:pPr>
-        <w:keepNext/>
-        <w:keepLines/>
-        <w:shd w:fill="1E293B" w:color="auto" w:val="clear"/>
-        <w:spacing w:after="0" w:before="0" w:line="260"/>
-        <w:ind w:left="120" w:right="120"/>
-      </w:pPr>
-      <w:r>
-        <w:rPr>
-          <w:rFonts w:ascii="Consolas" w:cs="Consolas" w:eastAsia="Consolas" w:hAnsi="Consolas"/>
-          <w:color w:val="F1F5F9"/>
-          <w:sz w:val="18"/>
-          <w:szCs w:val="18"/>
-        </w:rPr>
-        <w:t xml:space="preserve">density(d$Minuten, kernel = "epanechnikov")        # anderer Kern ("gaussian", "rectangular", "triangular", "biweight")</w:t>
+        <w:t xml:space="preserve">density(d$Dauer, bw = 5)                         # Bandweite festlegen</w:t>
+      </w:r>
+    </w:p>
+    <w:p>
+      <w:pPr>
+        <w:keepNext/>
+        <w:keepLines/>
+        <w:shd w:fill="1E293B" w:color="auto" w:val="clear"/>
+        <w:spacing w:after="0" w:before="0" w:line="260"/>
+        <w:ind w:left="120" w:right="120"/>
+      </w:pPr>
+      <w:r>
+        <w:rPr>
+          <w:rFonts w:ascii="Consolas" w:cs="Consolas" w:eastAsia="Consolas" w:hAnsi="Consolas"/>
+          <w:color w:val="F1F5F9"/>
+          <w:sz w:val="18"/>
+          <w:szCs w:val="18"/>
+        </w:rPr>
+        <w:t xml:space="preserve">density(d$Dauer, kernel = "epanechnikov")        # anderer Kern ("gaussian", "rectangular", "triangular", "biweight")</w:t>
       </w:r>
     </w:p>
     <w:p>
@@ -8768,7 +9076,7 @@
           <w:sz w:val="18"/>
           <w:szCs w:val="18"/>
         </w:rPr>
-        <w:t xml:space="preserve">hist(d$Minuten, freq = FALSE); lines(density(d$Minuten), col = "red")</w:t>
+        <w:t xml:space="preserve">hist(d$Dauer, freq = FALSE); lines(density(d$Dauer), col = "red")</w:t>
       </w:r>
     </w:p>
     <w:p>
@@ -8852,7 +9160,7 @@
           <w:sz w:val="18"/>
           <w:szCs w:val="18"/>
         </w:rPr>
-        <w:t xml:space="preserve">t.test(d$Minuten, mu = 70, alternative = "less", conf.level = 0.95)</w:t>
+        <w:t xml:space="preserve">t.test(d$Dauer, mu = 30, alternative = "greater", conf.level = 0.95)</w:t>
       </w:r>
     </w:p>
     <w:p>
@@ -8906,43 +9214,43 @@
           <w:sz w:val="18"/>
           <w:szCs w:val="18"/>
         </w:rPr>
-        <w:t xml:space="preserve">data:  d$Minuten</w:t>
-      </w:r>
-    </w:p>
-    <w:p>
-      <w:pPr>
-        <w:keepNext/>
-        <w:keepLines/>
-        <w:shd w:fill="1E293B" w:color="auto" w:val="clear"/>
-        <w:spacing w:after="0" w:before="0" w:line="260"/>
-        <w:ind w:left="120" w:right="120"/>
-      </w:pPr>
-      <w:r>
-        <w:rPr>
-          <w:rFonts w:ascii="Consolas" w:cs="Consolas" w:eastAsia="Consolas" w:hAnsi="Consolas"/>
-          <w:color w:val="F1F5F9"/>
-          <w:sz w:val="18"/>
-          <w:szCs w:val="18"/>
-        </w:rPr>
-        <w:t xml:space="preserve">t = -1.1175, df = 79, p-value = 0.1336</w:t>
-      </w:r>
-    </w:p>
-    <w:p>
-      <w:pPr>
-        <w:keepNext/>
-        <w:keepLines/>
-        <w:shd w:fill="1E293B" w:color="auto" w:val="clear"/>
-        <w:spacing w:after="0" w:before="0" w:line="260"/>
-        <w:ind w:left="120" w:right="120"/>
-      </w:pPr>
-      <w:r>
-        <w:rPr>
-          <w:rFonts w:ascii="Consolas" w:cs="Consolas" w:eastAsia="Consolas" w:hAnsi="Consolas"/>
-          <w:color w:val="F1F5F9"/>
-          <w:sz w:val="18"/>
-          <w:szCs w:val="18"/>
-        </w:rPr>
-        <w:t xml:space="preserve">alternative hypothesis: true mean is less than 70</w:t>
+        <w:t xml:space="preserve">data:  d$Dauer</w:t>
+      </w:r>
+    </w:p>
+    <w:p>
+      <w:pPr>
+        <w:keepNext/>
+        <w:keepLines/>
+        <w:shd w:fill="1E293B" w:color="auto" w:val="clear"/>
+        <w:spacing w:after="0" w:before="0" w:line="260"/>
+        <w:ind w:left="120" w:right="120"/>
+      </w:pPr>
+      <w:r>
+        <w:rPr>
+          <w:rFonts w:ascii="Consolas" w:cs="Consolas" w:eastAsia="Consolas" w:hAnsi="Consolas"/>
+          <w:color w:val="F1F5F9"/>
+          <w:sz w:val="18"/>
+          <w:szCs w:val="18"/>
+        </w:rPr>
+        <w:t xml:space="preserve">t = 0.74526, df = 79, p-value = 0.2292</w:t>
+      </w:r>
+    </w:p>
+    <w:p>
+      <w:pPr>
+        <w:keepNext/>
+        <w:keepLines/>
+        <w:shd w:fill="1E293B" w:color="auto" w:val="clear"/>
+        <w:spacing w:after="0" w:before="0" w:line="260"/>
+        <w:ind w:left="120" w:right="120"/>
+      </w:pPr>
+      <w:r>
+        <w:rPr>
+          <w:rFonts w:ascii="Consolas" w:cs="Consolas" w:eastAsia="Consolas" w:hAnsi="Consolas"/>
+          <w:color w:val="F1F5F9"/>
+          <w:sz w:val="18"/>
+          <w:szCs w:val="18"/>
+        </w:rPr>
+        <w:t xml:space="preserve">alternative hypothesis: true mean is greater than 30</w:t>
       </w:r>
     </w:p>
     <w:p>
@@ -8978,7 +9286,7 @@
           <w:sz w:val="18"/>
           <w:szCs w:val="18"/>
         </w:rPr>
-        <w:t xml:space="preserve">     -Inf 70.84423</w:t>
+        <w:t xml:space="preserve"> 29.21378      Inf</w:t>
       </w:r>
     </w:p>
     <w:p>
@@ -9032,7 +9340,7 @@
           <w:sz w:val="18"/>
           <w:szCs w:val="18"/>
         </w:rPr>
-        <w:t xml:space="preserve">   68.275</w:t>
+        <w:t xml:space="preserve">  30.6375</w:t>
       </w:r>
     </w:p>
     <w:tbl>
@@ -9462,7 +9770,7 @@
           <w:sz w:val="18"/>
           <w:szCs w:val="18"/>
         </w:rPr>
-        <w:t xml:space="preserve">t.test(Minuten ~ Abo, data = d)                   # Zwei-Stichproben-t-Test (Gruppen)</w:t>
+        <w:t xml:space="preserve">t.test(Dauer ~ Typ, data = d)                      # Zwei-Stichproben-t-Test (Gruppen)</w:t>
       </w:r>
     </w:p>
     <w:p>
@@ -9516,7 +9824,7 @@
           <w:sz w:val="18"/>
           <w:szCs w:val="18"/>
         </w:rPr>
-        <w:t xml:space="preserve">chisq.test(table(d$Studio, d$Abo))                # χ²-Unabhängigkeitstest</w:t>
+        <w:t xml:space="preserve">chisq.test(table(d$Mensa, d$Typ))                # χ²-Unabhängigkeitstest</w:t>
       </w:r>
     </w:p>
     <w:p>
@@ -9668,7 +9976,7 @@
         <w:t xml:space="preserve">✎ ANTWORTSATZ: </w:t>
       </w:r>
       <w:r>
-        <w:t xml:space="preserve">„Hypothesen: H₀: μ ≥ 70 vs. H₁: μ &lt; 70. Der p-Wert beträgt 0.134 &gt; 0.05 = α. Daher kann H₀ nicht abgelehnt werden: Es kann nicht statistisch abgesichert werden, dass die mittlere Trainingsdauer weniger als 70 Minuten beträgt.“</w:t>
+        <w:t xml:space="preserve">„Hypothesen: H₀: μ ≤ 30 vs. H₁: μ &gt; 30. Der p-Wert beträgt 0.229 &gt; 0.05 = α. Daher kann H₀ nicht abgelehnt werden: Es kann nicht statistisch abgesichert werden, dass die mittlere Aufenthaltsdauer mehr als 30 Minuten beträgt.“</w:t>
       </w:r>
     </w:p>
     <w:p>
@@ -10648,7 +10956,7 @@
           <w:sz w:val="18"/>
           <w:szCs w:val="18"/>
         </w:rPr>
-        <w:t xml:space="preserve">d &lt;- read.csv("Fitness.csv", sep = ",", dec = ".", header = TRUE)</w:t>
+        <w:t xml:space="preserve">d &lt;- read.csv("Beispiel_Mensa.csv", sep = ",", dec = ".", header = TRUE)</w:t>
       </w:r>
     </w:p>
     <w:p>
@@ -10720,7 +11028,7 @@
           <w:sz w:val="18"/>
           <w:szCs w:val="18"/>
         </w:rPr>
-        <w:t xml:space="preserve">class(d$Studio); class(d$Besuche)</w:t>
+        <w:t xml:space="preserve">class(d$Mensa); class(d$Gerichte)</w:t>
       </w:r>
     </w:p>
     <w:p>
@@ -10774,25 +11082,25 @@
           <w:sz w:val="18"/>
           <w:szCs w:val="18"/>
         </w:rPr>
-        <w:t xml:space="preserve">round(median(d$Minuten), 3); round(IQR(d$Minuten), 3)</w:t>
-      </w:r>
-    </w:p>
-    <w:p>
-      <w:pPr>
-        <w:keepNext/>
-        <w:keepLines/>
-        <w:shd w:fill="1E293B" w:color="auto" w:val="clear"/>
-        <w:spacing w:after="0" w:before="0" w:line="260"/>
-        <w:ind w:left="120" w:right="120"/>
-      </w:pPr>
-      <w:r>
-        <w:rPr>
-          <w:rFonts w:ascii="Consolas" w:cs="Consolas" w:eastAsia="Consolas" w:hAnsi="Consolas"/>
-          <w:color w:val="F1F5F9"/>
-          <w:sz w:val="18"/>
-          <w:szCs w:val="18"/>
-        </w:rPr>
-        <w:t xml:space="preserve">round(mean(d$Minuten), 3);   round(sd(d$Minuten), 3)</w:t>
+        <w:t xml:space="preserve">round(median(d$Dauer), 3); round(IQR(d$Dauer), 3)</w:t>
+      </w:r>
+    </w:p>
+    <w:p>
+      <w:pPr>
+        <w:keepNext/>
+        <w:keepLines/>
+        <w:shd w:fill="1E293B" w:color="auto" w:val="clear"/>
+        <w:spacing w:after="0" w:before="0" w:line="260"/>
+        <w:ind w:left="120" w:right="120"/>
+      </w:pPr>
+      <w:r>
+        <w:rPr>
+          <w:rFonts w:ascii="Consolas" w:cs="Consolas" w:eastAsia="Consolas" w:hAnsi="Consolas"/>
+          <w:color w:val="F1F5F9"/>
+          <w:sz w:val="18"/>
+          <w:szCs w:val="18"/>
+        </w:rPr>
+        <w:t xml:space="preserve">round(mean(d$Dauer), 3);   round(sd(d$Dauer), 3)</w:t>
       </w:r>
     </w:p>
     <w:p>
@@ -10864,25 +11172,25 @@
           <w:sz w:val="18"/>
           <w:szCs w:val="18"/>
         </w:rPr>
-        <w:t xml:space="preserve">boxplot(Minuten ~ Studio, data = d, main = "Sitz 12, Matr.Nr. 12345678, Aufgabenteil e)",</w:t>
-      </w:r>
-    </w:p>
-    <w:p>
-      <w:pPr>
-        <w:keepNext/>
-        <w:keepLines/>
-        <w:shd w:fill="1E293B" w:color="auto" w:val="clear"/>
-        <w:spacing w:after="0" w:before="0" w:line="260"/>
-        <w:ind w:left="120" w:right="120"/>
-      </w:pPr>
-      <w:r>
-        <w:rPr>
-          <w:rFonts w:ascii="Consolas" w:cs="Consolas" w:eastAsia="Consolas" w:hAnsi="Consolas"/>
-          <w:color w:val="F1F5F9"/>
-          <w:sz w:val="18"/>
-          <w:szCs w:val="18"/>
-        </w:rPr>
-        <w:t xml:space="preserve">        xlab = "Studio", ylab = "Trainingsdauer in Minuten")</w:t>
+        <w:t xml:space="preserve">boxplot(Dauer ~ Mensa, data = d, main = "Sitz 12, Matr.Nr. 12345678, Aufgabenteil e)",</w:t>
+      </w:r>
+    </w:p>
+    <w:p>
+      <w:pPr>
+        <w:keepNext/>
+        <w:keepLines/>
+        <w:shd w:fill="1E293B" w:color="auto" w:val="clear"/>
+        <w:spacing w:after="0" w:before="0" w:line="260"/>
+        <w:ind w:left="120" w:right="120"/>
+      </w:pPr>
+      <w:r>
+        <w:rPr>
+          <w:rFonts w:ascii="Consolas" w:cs="Consolas" w:eastAsia="Consolas" w:hAnsi="Consolas"/>
+          <w:color w:val="F1F5F9"/>
+          <w:sz w:val="18"/>
+          <w:szCs w:val="18"/>
+        </w:rPr>
+        <w:t xml:space="preserve">        xlab = "Mensa", ylab = "Aufenthaltsdauer in Minuten")</w:t>
       </w:r>
     </w:p>
     <w:p>
@@ -10918,7 +11226,7 @@
           <w:sz w:val="18"/>
           <w:szCs w:val="18"/>
         </w:rPr>
-        <w:t xml:space="preserve">tapply(d$Minuten, d$Studio, median)</w:t>
+        <w:t xml:space="preserve">tapply(d$Dauer, d$Mensa, median)</w:t>
       </w:r>
     </w:p>
     <w:p>
@@ -10972,7 +11280,7 @@
           <w:sz w:val="18"/>
           <w:szCs w:val="18"/>
         </w:rPr>
-        <w:t xml:space="preserve">tab &lt;- table(d$Studio, d$Abo); tab</w:t>
+        <w:t xml:space="preserve">tab &lt;- table(d$Mensa, d$Typ); tab</w:t>
       </w:r>
     </w:p>
     <w:p>
@@ -11044,25 +11352,25 @@
           <w:sz w:val="18"/>
           <w:szCs w:val="18"/>
         </w:rPr>
-        <w:t xml:space="preserve">d$iL04 &lt;- dexp(d$Wartezeit, rate = 0.4)</w:t>
-      </w:r>
-    </w:p>
-    <w:p>
-      <w:pPr>
-        <w:keepNext/>
-        <w:keepLines/>
-        <w:shd w:fill="1E293B" w:color="auto" w:val="clear"/>
-        <w:spacing w:after="0" w:before="0" w:line="260"/>
-        <w:ind w:left="120" w:right="120"/>
-      </w:pPr>
-      <w:r>
-        <w:rPr>
-          <w:rFonts w:ascii="Consolas" w:cs="Consolas" w:eastAsia="Consolas" w:hAnsi="Consolas"/>
-          <w:color w:val="F1F5F9"/>
-          <w:sz w:val="18"/>
-          <w:szCs w:val="18"/>
-        </w:rPr>
-        <w:t xml:space="preserve">L &lt;- prod(d$iL04); L</w:t>
+        <w:t xml:space="preserve">d$iL02 &lt;- dexp(d$Wartezeit, rate = 0.2)</w:t>
+      </w:r>
+    </w:p>
+    <w:p>
+      <w:pPr>
+        <w:keepNext/>
+        <w:keepLines/>
+        <w:shd w:fill="1E293B" w:color="auto" w:val="clear"/>
+        <w:spacing w:after="0" w:before="0" w:line="260"/>
+        <w:ind w:left="120" w:right="120"/>
+      </w:pPr>
+      <w:r>
+        <w:rPr>
+          <w:rFonts w:ascii="Consolas" w:cs="Consolas" w:eastAsia="Consolas" w:hAnsi="Consolas"/>
+          <w:color w:val="F1F5F9"/>
+          <w:sz w:val="18"/>
+          <w:szCs w:val="18"/>
+        </w:rPr>
+        <w:t xml:space="preserve">L &lt;- prod(d$iL02); L</w:t>
       </w:r>
     </w:p>
     <w:p>
@@ -11134,7 +11442,7 @@
           <w:sz w:val="18"/>
           <w:szCs w:val="18"/>
         </w:rPr>
-        <w:t xml:space="preserve">lam &lt;- seq(0.30, 0.60, by = 0.05)</w:t>
+        <w:t xml:space="preserve">lam &lt;- seq(0.15, 0.35, by = 0.05)</w:t>
       </w:r>
     </w:p>
     <w:p>
@@ -11224,7 +11532,7 @@
           <w:sz w:val="18"/>
           <w:szCs w:val="18"/>
         </w:rPr>
-        <w:t xml:space="preserve">t.test(d$Minuten, mu = 70, alternative = "less")</w:t>
+        <w:t xml:space="preserve">t.test(d$Dauer, mu = 30, alternative = "greater")</w:t>
       </w:r>
     </w:p>
     <w:p>
@@ -11381,7 +11689,7 @@
                 <w:sz w:val="20"/>
                 <w:szCs w:val="20"/>
               </w:rPr>
-              <w:t xml:space="preserve">Die Variable Studio ist vom Typ character, die Variable Besuche vom Typ integer (ganze Zahlen).</w:t>
+              <w:t xml:space="preserve">Die Variable Mensa ist vom Typ character, die Variable Gerichte vom Typ integer (ganze Zahlen).</w:t>
             </w:r>
           </w:p>
         </w:tc>
@@ -11440,7 +11748,7 @@
                 <w:sz w:val="20"/>
                 <w:szCs w:val="20"/>
               </w:rPr>
-              <w:t xml:space="preserve">Das arithmetische Mittel der Variable Minuten beträgt 68.275, der unverzerrte Schätzer der Standardabweichung 13.807.</w:t>
+              <w:t xml:space="preserve">Das arithmetische Mittel der Variable Dauer beträgt 30.637, der unverzerrte Schätzer der Standardabweichung 7.651.</w:t>
             </w:r>
           </w:p>
         </w:tc>
@@ -11499,7 +11807,7 @@
                 <w:sz w:val="20"/>
                 <w:szCs w:val="20"/>
               </w:rPr>
-              <w:t xml:space="preserve">Der Median der Trainingsdauer beträgt 69.000 Minuten, der Interquartilsabstand 20.250 Minuten.</w:t>
+              <w:t xml:space="preserve">Der Median der Aufenthaltsdauer beträgt 30.000 Minuten, der Interquartilsabstand 11.000 Minuten.</w:t>
             </w:r>
           </w:p>
         </w:tc>
@@ -11558,7 +11866,7 @@
                 <w:sz w:val="20"/>
                 <w:szCs w:val="20"/>
               </w:rPr>
-              <w:t xml:space="preserve">Im Studio … ist der Median der Trainingsdauer am höchsten; dort streuen die Werte auch am stärksten.</w:t>
+              <w:t xml:space="preserve">In der Mensa Zentral ist der Median der Aufenthaltsdauer mit 33 Minuten am höchsten.</w:t>
             </w:r>
           </w:p>
         </w:tc>
@@ -11617,7 +11925,7 @@
                 <w:sz w:val="20"/>
                 <w:szCs w:val="20"/>
               </w:rPr>
-              <w:t xml:space="preserve">Mitglieder des Studios … trainieren im Durchschnitt am längsten (… Minuten).</w:t>
+              <w:t xml:space="preserve">Gäste der Mensa … bleiben im Durchschnitt am längsten (… Minuten).</w:t>
             </w:r>
           </w:p>
         </w:tc>
@@ -11676,7 +11984,7 @@
                 <w:sz w:val="20"/>
                 <w:szCs w:val="20"/>
               </w:rPr>
-              <w:t xml:space="preserve">Im Studio Nord ist der Anteil der Premium-Mitglieder mit 0.533 am höchsten.</w:t>
+              <w:t xml:space="preserve">In der Mensa Turm ist der Anteil der Mitarbeitenden mit 0.440 am höchsten.</w:t>
             </w:r>
           </w:p>
         </w:tc>
@@ -11735,7 +12043,7 @@
                 <w:sz w:val="20"/>
                 <w:szCs w:val="20"/>
               </w:rPr>
-              <w:t xml:space="preserve">Die Likelihood aller Beobachtungen unter λ = 0.4 beträgt 8.316 × 10^(−64).</w:t>
+              <w:t xml:space="preserve">Die Likelihood aller Beobachtungen unter λ = 0.2 beträgt 1.691 × 10^(−89).</w:t>
             </w:r>
           </w:p>
         </w:tc>
@@ -11794,7 +12102,7 @@
                 <w:sz w:val="20"/>
                 <w:szCs w:val="20"/>
               </w:rPr>
-              <w:t xml:space="preserve">Aus der vorgegebenen Menge maximiert λ = 0.45 die Likelihood; damit ist λ̂ = 0.45 der ML-Schätzer.</w:t>
+              <w:t xml:space="preserve">Aus der vorgegebenen Menge maximiert λ = 0.2 die Likelihood; damit ist λ̂ = 0.2 der ML-Schätzer.</w:t>
             </w:r>
           </w:p>
         </w:tc>

</xml_diff>